<commit_message>
Aggregation Demonstration with ColumnFamily and Document DB
</commit_message>
<xml_diff>
--- a/THEORY COURSE MATERIALS/Aggregation Demonstration with Mongodb and Cassandra.docx
+++ b/THEORY COURSE MATERIALS/Aggregation Demonstration with Mongodb and Cassandra.docx
@@ -8706,8 +8706,6 @@
         </w:rPr>
         <w:t>30 + 31 + 30 = 91</w:t>
       </w:r>
-      <w:bookmarkStart w:id="0" w:name="_GoBack"/>
-      <w:bookmarkEnd w:id="0"/>
     </w:p>
     <w:p>
       <w:pPr>
@@ -9523,6 +9521,26 @@
         </w:rPr>
         <w:t>.</w:t>
       </w:r>
+      <w:r>
+        <w:rPr>
+          <w:rFonts w:ascii="Times New Roman" w:eastAsia="Times New Roman" w:hAnsi="Times New Roman" w:cs="Times New Roman"/>
+          <w:sz w:val="28"/>
+          <w:szCs w:val="28"/>
+          <w:lang w:eastAsia="en-IN"/>
+        </w:rPr>
+        <w:t xml:space="preserve"> Row and column keys</w:t>
+      </w:r>
+      <w:r>
+        <w:rPr>
+          <w:rFonts w:ascii="Times New Roman" w:eastAsia="Times New Roman" w:hAnsi="Times New Roman" w:cs="Times New Roman"/>
+          <w:sz w:val="28"/>
+          <w:szCs w:val="28"/>
+          <w:lang w:eastAsia="en-IN"/>
+        </w:rPr>
+        <w:t>, both</w:t>
+      </w:r>
+      <w:bookmarkStart w:id="0" w:name="_GoBack"/>
+      <w:bookmarkEnd w:id="0"/>
     </w:p>
     <w:p>
       <w:pPr>

</xml_diff>

<commit_message>
Module 2 - Uploaded
</commit_message>
<xml_diff>
--- a/THEORY COURSE MATERIALS/Aggregation Demonstration with Mongodb and Cassandra.docx
+++ b/THEORY COURSE MATERIALS/Aggregation Demonstration with Mongodb and Cassandra.docx
@@ -1433,7 +1433,15 @@
           <w:szCs w:val="28"/>
           <w:lang w:val="en-US"/>
         </w:rPr>
-        <w:t xml:space="preserve">    "</w:t>
+        <w:t xml:space="preserve">    </w:t>
+      </w:r>
+      <w:r>
+        <w:rPr>
+          <w:sz w:val="28"/>
+          <w:szCs w:val="28"/>
+          <w:lang w:val="en-US"/>
+        </w:rPr>
+        <w:t>"</w:t>
       </w:r>
       <w:proofErr w:type="gramStart"/>
       <w:r>
@@ -1451,7 +1459,15 @@
           <w:szCs w:val="28"/>
           <w:lang w:val="en-US"/>
         </w:rPr>
-        <w:t>": "SRK",</w:t>
+        <w:t>": "A</w:t>
+      </w:r>
+      <w:r>
+        <w:rPr>
+          <w:sz w:val="28"/>
+          <w:szCs w:val="28"/>
+          <w:lang w:val="en-US"/>
+        </w:rPr>
+        <w:t>",</w:t>
       </w:r>
     </w:p>
     <w:p>
@@ -9539,26 +9555,26 @@
         </w:rPr>
         <w:t>, both</w:t>
       </w:r>
+    </w:p>
+    <w:p>
+      <w:pPr>
+        <w:rPr>
+          <w:sz w:val="28"/>
+          <w:szCs w:val="28"/>
+          <w:lang w:val="en-US"/>
+        </w:rPr>
+      </w:pPr>
+    </w:p>
+    <w:p>
+      <w:pPr>
+        <w:rPr>
+          <w:sz w:val="28"/>
+          <w:szCs w:val="28"/>
+          <w:lang w:val="en-US"/>
+        </w:rPr>
+      </w:pPr>
       <w:bookmarkStart w:id="0" w:name="_GoBack"/>
       <w:bookmarkEnd w:id="0"/>
-    </w:p>
-    <w:p>
-      <w:pPr>
-        <w:rPr>
-          <w:sz w:val="28"/>
-          <w:szCs w:val="28"/>
-          <w:lang w:val="en-US"/>
-        </w:rPr>
-      </w:pPr>
-    </w:p>
-    <w:p>
-      <w:pPr>
-        <w:rPr>
-          <w:sz w:val="28"/>
-          <w:szCs w:val="28"/>
-          <w:lang w:val="en-US"/>
-        </w:rPr>
-      </w:pPr>
     </w:p>
     <w:sectPr>
       <w:pgSz w:w="11906" w:h="16838"/>

</xml_diff>